<commit_message>
added report generation for maintenance log
</commit_message>
<xml_diff>
--- a/reports_output/vehicle_1_2026.docx
+++ b/reports_output/vehicle_1_2026.docx
@@ -17,6 +17,26 @@
         </w:rPr>
         <w:t xml:space="preserve">Report ID: </w:t>
       </w:r>
+      <w:r>
+        <w:rPr>
+          <w:rFonts w:ascii="Arial" w:eastAsia="Arial" w:hAnsi="Arial" w:cs="Arial"/>
+        </w:rPr>
+        <w:t>{{</w:t>
+      </w:r>
+      <w:proofErr w:type="spellStart"/>
+      <w:r>
+        <w:rPr>
+          <w:rFonts w:ascii="Arial" w:eastAsia="Arial" w:hAnsi="Arial" w:cs="Arial"/>
+        </w:rPr>
+        <w:t>report_id</w:t>
+      </w:r>
+      <w:proofErr w:type="spellEnd"/>
+      <w:r>
+        <w:rPr>
+          <w:rFonts w:ascii="Arial" w:eastAsia="Arial" w:hAnsi="Arial" w:cs="Arial"/>
+        </w:rPr>
+        <w:t>}}</w:t>
+      </w:r>
     </w:p>
     <w:p>
       <w:pPr>
@@ -28,10 +48,7 @@
         </w:rPr>
       </w:pPr>
       <w:r>
-        <w:rPr>
-          <w:rFonts w:ascii="Arial" w:eastAsia="Arial" w:hAnsi="Arial" w:cs="Arial"/>
-        </w:rPr>
-        <w:t>Generated by:</w:t>
+        <w:t>Generated by: Admin</w:t>
       </w:r>
     </w:p>
     <w:p>
@@ -44,10 +61,7 @@
         </w:rPr>
       </w:pPr>
       <w:r>
-        <w:rPr>
-          <w:rFonts w:ascii="Arial" w:eastAsia="Arial" w:hAnsi="Arial" w:cs="Arial"/>
-        </w:rPr>
-        <w:t>Date &amp; Time Generated:</w:t>
+        <w:t>Date &amp; Time Generated: 2026-01-09 16:31:38</w:t>
       </w:r>
     </w:p>
     <w:p>
@@ -492,6 +506,20 @@
     </w:p>
     <w:p>
       <w:pPr>
+        <w:rPr>
+          <w:rFonts w:ascii="Arial" w:eastAsia="Arial" w:hAnsi="Arial" w:cs="Arial"/>
+        </w:rPr>
+      </w:pPr>
+      <w:r>
+        <w:t>Sedan : 1</w:t>
+        <w:br/>
+        <w:t>Pick-up : 1</w:t>
+        <w:br/>
+        <w:t>Van : 1</w:t>
+      </w:r>
+    </w:p>
+    <w:p>
+      <w:pPr>
         <w:jc w:val="both"/>
         <w:rPr>
           <w:rFonts w:ascii="Arial" w:eastAsia="Arial" w:hAnsi="Arial" w:cs="Arial"/>
@@ -530,10 +558,7 @@
         </w:rPr>
       </w:pPr>
       <w:r>
-        <w:rPr>
-          <w:rFonts w:ascii="Arial" w:eastAsia="Arial" w:hAnsi="Arial" w:cs="Arial"/>
-        </w:rPr>
-        <w:t>Total Registered vehicles:</w:t>
+        <w:t>Total Registered vehicles: 3</w:t>
       </w:r>
     </w:p>
     <w:p>
@@ -549,10 +574,7 @@
         </w:rPr>
       </w:pPr>
       <w:r>
-        <w:rPr>
-          <w:rFonts w:ascii="Arial" w:eastAsia="Arial" w:hAnsi="Arial" w:cs="Arial"/>
-        </w:rPr>
-        <w:t>Active Vehicles:</w:t>
+        <w:t>Active Vehicles: 0</w:t>
       </w:r>
     </w:p>
     <w:p>
@@ -568,10 +590,7 @@
         </w:rPr>
       </w:pPr>
       <w:r>
-        <w:rPr>
-          <w:rFonts w:ascii="Arial" w:eastAsia="Arial" w:hAnsi="Arial" w:cs="Arial"/>
-        </w:rPr>
-        <w:t>Inactive Vehicles</w:t>
+        <w:t>Inactive Vehicles 1</w:t>
       </w:r>
     </w:p>
     <w:p>
@@ -587,10 +606,7 @@
         </w:rPr>
       </w:pPr>
       <w:r>
-        <w:rPr>
-          <w:rFonts w:ascii="Arial" w:eastAsia="Arial" w:hAnsi="Arial" w:cs="Arial"/>
-        </w:rPr>
-        <w:t xml:space="preserve">Under Maintenance: </w:t>
+        <w:t>Under Maintenance: 1</w:t>
       </w:r>
     </w:p>
     <w:p>
@@ -606,10 +622,7 @@
         </w:rPr>
       </w:pPr>
       <w:r>
-        <w:rPr>
-          <w:rFonts w:ascii="Arial" w:eastAsia="Arial" w:hAnsi="Arial" w:cs="Arial"/>
-        </w:rPr>
-        <w:t>Most Mileage</w:t>
+        <w:t>Most Mileage: Ford Ranger (89210km)</w:t>
       </w:r>
     </w:p>
     <w:p>
@@ -1349,7 +1362,7 @@
             </wp:anchor>
           </w:drawing>
         </mc:Choice>
-        <mc:Fallback xmlns:sl="http://schemas.openxmlformats.org/schemaLibrary/2006/main" xmlns:a="http://schemas.openxmlformats.org/drawingml/2006/main" xmlns:pic="http://schemas.openxmlformats.org/drawingml/2006/picture" xmlns:c="http://schemas.openxmlformats.org/drawingml/2006/chart" xmlns:lc="http://schemas.openxmlformats.org/drawingml/2006/lockedCanvas" xmlns:dgm="http://schemas.openxmlformats.org/drawingml/2006/diagram" xmlns="http://schemas.microsoft.com/office/tasks/2019/documenttasks" xmlns:cr="http://schemas.microsoft.com/office/comments/2020/reactions">
+        <mc:Fallback xmlns:cr="http://schemas.microsoft.com/office/comments/2020/reactions" xmlns="http://schemas.microsoft.com/office/tasks/2019/documenttasks" xmlns:dgm="http://schemas.openxmlformats.org/drawingml/2006/diagram" xmlns:lc="http://schemas.openxmlformats.org/drawingml/2006/lockedCanvas" xmlns:c="http://schemas.openxmlformats.org/drawingml/2006/chart" xmlns:pic="http://schemas.openxmlformats.org/drawingml/2006/picture" xmlns:a="http://schemas.openxmlformats.org/drawingml/2006/main" xmlns:sl="http://schemas.openxmlformats.org/schemaLibrary/2006/main">
           <w:drawing>
             <wp:anchor allowOverlap="1" behindDoc="0" distB="0" distT="0" distL="114300" distR="114300" hidden="0" layoutInCell="1" locked="0" relativeHeight="0" simplePos="0">
               <wp:simplePos x="0" y="0"/>

</xml_diff>

<commit_message>
modifid app.py, added users
</commit_message>
<xml_diff>
--- a/reports_output/vehicle_1_2026.docx
+++ b/reports_output/vehicle_1_2026.docx
@@ -48,7 +48,7 @@
         </w:rPr>
       </w:pPr>
       <w:r>
-        <w:t>Generated by: Admin</w:t>
+        <w:t>Generated by: Mechanic</w:t>
       </w:r>
     </w:p>
     <w:p>
@@ -61,7 +61,7 @@
         </w:rPr>
       </w:pPr>
       <w:r>
-        <w:t>Date &amp; Time Generated: 2026-01-10 13:05:39</w:t>
+        <w:t>Date &amp; Time Generated: 2026-01-20 14:49:06</w:t>
       </w:r>
     </w:p>
     <w:p>
@@ -269,7 +269,7 @@
           </w:tcPr>
           <w:p>
             <w:r>
-              <w:t>Ford Ranger</w:t>
+              <w:t>Jeep</w:t>
             </w:r>
           </w:p>
         </w:tc>
@@ -279,7 +279,7 @@
           </w:tcPr>
           <w:p>
             <w:r>
-              <w:t>SHB 201</w:t>
+              <w:t>p334</w:t>
             </w:r>
           </w:p>
         </w:tc>
@@ -289,7 +289,7 @@
           </w:tcPr>
           <w:p>
             <w:r>
-              <w:t>Black</w:t>
+              <w:t>e[</w:t>
             </w:r>
           </w:p>
         </w:tc>
@@ -299,7 +299,7 @@
           </w:tcPr>
           <w:p>
             <w:r>
-              <w:t>Pick-up</w:t>
+              <w:t>Sedan</w:t>
             </w:r>
           </w:p>
         </w:tc>
@@ -309,7 +309,7 @@
           </w:tcPr>
           <w:p>
             <w:r>
-              <w:t>Maintenance</w:t>
+              <w:t>Active</w:t>
             </w:r>
           </w:p>
         </w:tc>
@@ -319,7 +319,7 @@
           </w:tcPr>
           <w:p>
             <w:r>
-              <w:t>89210</w:t>
+              <w:t>100</w:t>
             </w:r>
           </w:p>
         </w:tc>
@@ -331,7 +331,7 @@
           </w:tcPr>
           <w:p>
             <w:r>
-              <w:t>Honda Civic</w:t>
+              <w:t>Toyota Vios</w:t>
             </w:r>
           </w:p>
         </w:tc>
@@ -341,7 +341,7 @@
           </w:tcPr>
           <w:p>
             <w:r>
-              <w:t>SKN 211</w:t>
+              <w:t>ABC123</w:t>
             </w:r>
           </w:p>
         </w:tc>
@@ -351,7 +351,7 @@
           </w:tcPr>
           <w:p>
             <w:r>
-              <w:t>White</w:t>
+              <w:t>Red</w:t>
             </w:r>
           </w:p>
         </w:tc>
@@ -371,7 +371,7 @@
           </w:tcPr>
           <w:p>
             <w:r>
-              <w:t>Inactive</w:t>
+              <w:t>Active</w:t>
             </w:r>
           </w:p>
         </w:tc>
@@ -381,7 +381,7 @@
           </w:tcPr>
           <w:p>
             <w:r>
-              <w:t>67373</w:t>
+              <w:t>100</w:t>
             </w:r>
           </w:p>
         </w:tc>
@@ -393,7 +393,7 @@
           </w:tcPr>
           <w:p>
             <w:r>
-              <w:t>Hyundai Starex</w:t>
+              <w:t>Toyota Wigo</w:t>
             </w:r>
           </w:p>
         </w:tc>
@@ -403,7 +403,7 @@
           </w:tcPr>
           <w:p>
             <w:r>
-              <w:t>SHZ 155</w:t>
+              <w:t>ABC123</w:t>
             </w:r>
           </w:p>
         </w:tc>
@@ -413,7 +413,7 @@
           </w:tcPr>
           <w:p>
             <w:r>
-              <w:t>Gray</w:t>
+              <w:t>White</w:t>
             </w:r>
           </w:p>
         </w:tc>
@@ -423,7 +423,7 @@
           </w:tcPr>
           <w:p>
             <w:r>
-              <w:t>Van</w:t>
+              <w:t>Sedan</w:t>
             </w:r>
           </w:p>
         </w:tc>
@@ -443,7 +443,7 @@
           </w:tcPr>
           <w:p>
             <w:r>
-              <w:t>41902</w:t>
+              <w:t>100</w:t>
             </w:r>
           </w:p>
         </w:tc>
@@ -455,7 +455,7 @@
           </w:tcPr>
           <w:p>
             <w:r>
-              <w:t>Toyota Vios</w:t>
+              <w:t>Toyota Wigo</w:t>
             </w:r>
           </w:p>
         </w:tc>
@@ -475,7 +475,7 @@
           </w:tcPr>
           <w:p>
             <w:r>
-              <w:t>Red</w:t>
+              <w:t>White</w:t>
             </w:r>
           </w:p>
         </w:tc>
@@ -494,7 +494,9 @@
             <w:tcW w:type="dxa" w:w="1483"/>
           </w:tcPr>
           <w:p>
-            <w:r/>
+            <w:r>
+              <w:t>Active</w:t>
+            </w:r>
           </w:p>
         </w:tc>
         <w:tc>
@@ -571,11 +573,7 @@
         </w:rPr>
       </w:pPr>
       <w:r>
-        <w:t>Sedan : 2</w:t>
-        <w:br/>
-        <w:t>Pick-up : 1</w:t>
-        <w:br/>
-        <w:t>Van : 1</w:t>
+        <w:t>Sedan : 4</w:t>
       </w:r>
     </w:p>
     <w:p>
@@ -650,7 +648,7 @@
         </w:rPr>
       </w:pPr>
       <w:r>
-        <w:t>Inactive Vehicles 1</w:t>
+        <w:t>Inactive Vehicles 0</w:t>
       </w:r>
     </w:p>
     <w:p>
@@ -666,7 +664,7 @@
         </w:rPr>
       </w:pPr>
       <w:r>
-        <w:t>Under Maintenance: 1</w:t>
+        <w:t>Under Maintenance: 0</w:t>
       </w:r>
     </w:p>
     <w:p>
@@ -682,7 +680,7 @@
         </w:rPr>
       </w:pPr>
       <w:r>
-        <w:t>Most Mileage: Ford Ranger (89210km)</w:t>
+        <w:t>Most Mileage: Toyota Vios (100km)</w:t>
       </w:r>
     </w:p>
     <w:p>

</xml_diff>